<commit_message>
Interfaces, project.java and renaming author
Also changed the class diagram to reflect the changes in my plan
</commit_message>
<xml_diff>
--- a/report.docx
+++ b/report.docx
@@ -485,10 +485,10 @@
           <w:noProof/>
         </w:rPr>
         <w:drawing>
-          <wp:inline distT="0" distB="0" distL="0" distR="0" wp14:anchorId="730F0258" wp14:editId="314AF202">
-            <wp:extent cx="5901352" cy="8458200"/>
-            <wp:effectExtent l="0" t="0" r="4445" b="0"/>
-            <wp:docPr id="283829079" name="Picture 3"/>
+          <wp:inline distT="0" distB="0" distL="0" distR="0" wp14:anchorId="4E339861" wp14:editId="318EFC6F">
+            <wp:extent cx="5867400" cy="8414768"/>
+            <wp:effectExtent l="0" t="0" r="0" b="5715"/>
+            <wp:docPr id="1243949860" name="Picture 1"/>
             <wp:cNvGraphicFramePr>
               <a:graphicFrameLocks xmlns:a="http://schemas.openxmlformats.org/drawingml/2006/main" noChangeAspect="1"/>
             </wp:cNvGraphicFramePr>
@@ -496,7 +496,7 @@
               <a:graphicData uri="http://schemas.openxmlformats.org/drawingml/2006/picture">
                 <pic:pic xmlns:pic="http://schemas.openxmlformats.org/drawingml/2006/picture">
                   <pic:nvPicPr>
-                    <pic:cNvPr id="0" name="Picture 3"/>
+                    <pic:cNvPr id="0" name="Picture 1"/>
                     <pic:cNvPicPr>
                       <a:picLocks noChangeAspect="1" noChangeArrowheads="1"/>
                     </pic:cNvPicPr>
@@ -517,7 +517,7 @@
                   <pic:spPr bwMode="auto">
                     <a:xfrm>
                       <a:off x="0" y="0"/>
-                      <a:ext cx="5909789" cy="8470293"/>
+                      <a:ext cx="5882824" cy="8436888"/>
                     </a:xfrm>
                     <a:prstGeom prst="rect">
                       <a:avLst/>
@@ -1758,23 +1758,6 @@
 </file>
 
 <file path=customXml/item1.xml><?xml version="1.0" encoding="utf-8"?>
-<p:properties xmlns:p="http://schemas.microsoft.com/office/2006/metadata/properties" xmlns:xsi="http://www.w3.org/2001/XMLSchema-instance" xmlns:pc="http://schemas.microsoft.com/office/infopath/2007/PartnerControls">
-  <documentManagement>
-    <_activity xmlns="bc076155-b42d-49c0-9103-56bbb3703038" xsi:nil="true"/>
-  </documentManagement>
-</p:properties>
-</file>
-
-<file path=customXml/item2.xml><?xml version="1.0" encoding="utf-8"?>
-<?mso-contentType ?>
-<FormTemplates xmlns="http://schemas.microsoft.com/sharepoint/v3/contenttype/forms">
-  <Display>DocumentLibraryForm</Display>
-  <Edit>DocumentLibraryForm</Edit>
-  <New>DocumentLibraryForm</New>
-</FormTemplates>
-</file>
-
-<file path=customXml/item3.xml><?xml version="1.0" encoding="utf-8"?>
 <ct:contentTypeSchema xmlns:ct="http://schemas.microsoft.com/office/2006/metadata/contentType" xmlns:ma="http://schemas.microsoft.com/office/2006/metadata/properties/metaAttributes" ct:_="" ma:_="" ma:contentTypeName="Document" ma:contentTypeID="0x01010039CF77FF9592144BB7065041DD04ADBC" ma:contentTypeVersion="11" ma:contentTypeDescription="Create a new document." ma:contentTypeScope="" ma:versionID="b45905e52b44292dc4bcc63ac44bf539">
   <xsd:schema xmlns:xsd="http://www.w3.org/2001/XMLSchema" xmlns:xs="http://www.w3.org/2001/XMLSchema" xmlns:p="http://schemas.microsoft.com/office/2006/metadata/properties" xmlns:ns3="bc076155-b42d-49c0-9103-56bbb3703038" targetNamespace="http://schemas.microsoft.com/office/2006/metadata/properties" ma:root="true" ma:fieldsID="8f1844e9226261b95c2a24cdda653633" ns3:_="">
     <xsd:import namespace="bc076155-b42d-49c0-9103-56bbb3703038"/>
@@ -1962,25 +1945,24 @@
 </ct:contentTypeSchema>
 </file>
 
-<file path=customXml/itemProps1.xml><?xml version="1.0" encoding="utf-8"?>
-<ds:datastoreItem xmlns:ds="http://schemas.openxmlformats.org/officeDocument/2006/customXml" ds:itemID="{56FF02F6-7DF6-4DF7-8B4F-A6E693DD93C3}">
-  <ds:schemaRefs>
-    <ds:schemaRef ds:uri="http://schemas.microsoft.com/office/2006/metadata/properties"/>
-    <ds:schemaRef ds:uri="http://schemas.microsoft.com/office/infopath/2007/PartnerControls"/>
-    <ds:schemaRef ds:uri="bc076155-b42d-49c0-9103-56bbb3703038"/>
-  </ds:schemaRefs>
-</ds:datastoreItem>
+<file path=customXml/item2.xml><?xml version="1.0" encoding="utf-8"?>
+<?mso-contentType ?>
+<FormTemplates xmlns="http://schemas.microsoft.com/sharepoint/v3/contenttype/forms">
+  <Display>DocumentLibraryForm</Display>
+  <Edit>DocumentLibraryForm</Edit>
+  <New>DocumentLibraryForm</New>
+</FormTemplates>
 </file>
 
-<file path=customXml/itemProps2.xml><?xml version="1.0" encoding="utf-8"?>
-<ds:datastoreItem xmlns:ds="http://schemas.openxmlformats.org/officeDocument/2006/customXml" ds:itemID="{A37415C9-9CDF-4469-9544-1B9FEA9E33FD}">
-  <ds:schemaRefs>
-    <ds:schemaRef ds:uri="http://schemas.microsoft.com/sharepoint/v3/contenttype/forms"/>
-  </ds:schemaRefs>
-</ds:datastoreItem>
+<file path=customXml/item3.xml><?xml version="1.0" encoding="utf-8"?>
+<p:properties xmlns:p="http://schemas.microsoft.com/office/2006/metadata/properties" xmlns:xsi="http://www.w3.org/2001/XMLSchema-instance" xmlns:pc="http://schemas.microsoft.com/office/infopath/2007/PartnerControls">
+  <documentManagement>
+    <_activity xmlns="bc076155-b42d-49c0-9103-56bbb3703038" xsi:nil="true"/>
+  </documentManagement>
+</p:properties>
 </file>
 
-<file path=customXml/itemProps3.xml><?xml version="1.0" encoding="utf-8"?>
+<file path=customXml/itemProps1.xml><?xml version="1.0" encoding="utf-8"?>
 <ds:datastoreItem xmlns:ds="http://schemas.openxmlformats.org/officeDocument/2006/customXml" ds:itemID="{3DFADE27-50DD-4985-9BF5-ABF102536167}">
   <ds:schemaRefs>
     <ds:schemaRef ds:uri="http://schemas.microsoft.com/office/2006/metadata/contentType"/>
@@ -1996,4 +1978,22 @@
     <ds:schemaRef ds:uri="http://schemas.microsoft.com/internal/obd"/>
   </ds:schemaRefs>
 </ds:datastoreItem>
+</file>
+
+<file path=customXml/itemProps2.xml><?xml version="1.0" encoding="utf-8"?>
+<ds:datastoreItem xmlns:ds="http://schemas.openxmlformats.org/officeDocument/2006/customXml" ds:itemID="{A37415C9-9CDF-4469-9544-1B9FEA9E33FD}">
+  <ds:schemaRefs>
+    <ds:schemaRef ds:uri="http://schemas.microsoft.com/sharepoint/v3/contenttype/forms"/>
+  </ds:schemaRefs>
+</ds:datastoreItem>
+</file>
+
+<file path=customXml/itemProps3.xml><?xml version="1.0" encoding="utf-8"?>
+<ds:datastoreItem xmlns:ds="http://schemas.openxmlformats.org/officeDocument/2006/customXml" ds:itemID="{56FF02F6-7DF6-4DF7-8B4F-A6E693DD93C3}">
+  <ds:schemaRefs>
+    <ds:schemaRef ds:uri="http://schemas.microsoft.com/office/2006/metadata/properties"/>
+    <ds:schemaRef ds:uri="http://schemas.microsoft.com/office/infopath/2007/PartnerControls"/>
+    <ds:schemaRef ds:uri="bc076155-b42d-49c0-9103-56bbb3703038"/>
+  </ds:schemaRefs>
+</ds:datastoreItem>
 </file>
</xml_diff>

<commit_message>
Finished priority queue and doubly linked list
Changed Area to extend Item and Project doesnt extend Item anymore.

Finished the priority queue and doubly linked list implementations.

Changed class diagram to match design changes.

Replaced DoublyLinkedInterface and SinglyLinkedInterface with LinearListInterface
</commit_message>
<xml_diff>
--- a/report.docx
+++ b/report.docx
@@ -485,10 +485,10 @@
           <w:noProof/>
         </w:rPr>
         <w:drawing>
-          <wp:inline distT="0" distB="0" distL="0" distR="0" wp14:anchorId="4E339861" wp14:editId="318EFC6F">
-            <wp:extent cx="5867400" cy="8414768"/>
-            <wp:effectExtent l="0" t="0" r="0" b="5715"/>
-            <wp:docPr id="1243949860" name="Picture 1"/>
+          <wp:inline distT="0" distB="0" distL="0" distR="0" wp14:anchorId="52C949EA" wp14:editId="48C80264">
+            <wp:extent cx="6184900" cy="7581900"/>
+            <wp:effectExtent l="0" t="0" r="6350" b="0"/>
+            <wp:docPr id="1930160561" name="Picture 2"/>
             <wp:cNvGraphicFramePr>
               <a:graphicFrameLocks xmlns:a="http://schemas.openxmlformats.org/drawingml/2006/main" noChangeAspect="1"/>
             </wp:cNvGraphicFramePr>
@@ -496,7 +496,7 @@
               <a:graphicData uri="http://schemas.openxmlformats.org/drawingml/2006/picture">
                 <pic:pic xmlns:pic="http://schemas.openxmlformats.org/drawingml/2006/picture">
                   <pic:nvPicPr>
-                    <pic:cNvPr id="0" name="Picture 1"/>
+                    <pic:cNvPr id="0" name="Picture 2"/>
                     <pic:cNvPicPr>
                       <a:picLocks noChangeAspect="1" noChangeArrowheads="1"/>
                     </pic:cNvPicPr>
@@ -517,7 +517,7 @@
                   <pic:spPr bwMode="auto">
                     <a:xfrm>
                       <a:off x="0" y="0"/>
-                      <a:ext cx="5882824" cy="8436888"/>
+                      <a:ext cx="6184900" cy="7581900"/>
                     </a:xfrm>
                     <a:prstGeom prst="rect">
                       <a:avLst/>

</xml_diff>

<commit_message>
Fixed GUI problems and small error with project urgency
</commit_message>
<xml_diff>
--- a/report.docx
+++ b/report.docx
@@ -45,95 +45,18 @@
     </w:p>
     <w:p>
       <w:pPr>
-        <w:pStyle w:val="Heading1"/>
+        <w:jc w:val="center"/>
+        <w:rPr>
+          <w:sz w:val="24"/>
+          <w:szCs w:val="24"/>
+        </w:rPr>
       </w:pPr>
       <w:r>
-        <w:t>Smart Docklands Theme</w:t>
-      </w:r>
-    </w:p>
-    <w:p>
-      <w:pPr>
-        <w:rPr>
-          <w:sz w:val="24"/>
-          <w:szCs w:val="24"/>
-        </w:rPr>
-      </w:pPr>
-      <w:r>
-        <w:rPr>
-          <w:sz w:val="24"/>
-          <w:szCs w:val="24"/>
-        </w:rPr>
-        <w:t>This</w:t>
-      </w:r>
-      <w:r>
-        <w:rPr>
-          <w:sz w:val="24"/>
-          <w:szCs w:val="24"/>
-        </w:rPr>
-        <w:t xml:space="preserve"> application </w:t>
-      </w:r>
-      <w:r>
-        <w:rPr>
-          <w:sz w:val="24"/>
-          <w:szCs w:val="24"/>
-        </w:rPr>
-        <w:t xml:space="preserve">was developed as a solution to the </w:t>
-      </w:r>
-      <w:r>
-        <w:rPr>
-          <w:sz w:val="24"/>
-          <w:szCs w:val="24"/>
-        </w:rPr>
-        <w:t>2025 Smart Docklands</w:t>
-      </w:r>
-      <w:r>
-        <w:rPr>
-          <w:sz w:val="24"/>
-          <w:szCs w:val="24"/>
-        </w:rPr>
-        <w:t xml:space="preserve"> </w:t>
-      </w:r>
-      <w:r>
-        <w:rPr>
-          <w:sz w:val="24"/>
-          <w:szCs w:val="24"/>
-        </w:rPr>
-        <w:t>programme call for pilots.</w:t>
-      </w:r>
-      <w:r>
-        <w:rPr>
-          <w:sz w:val="24"/>
-          <w:szCs w:val="24"/>
-        </w:rPr>
-        <w:t xml:space="preserve"> The theme I chose from the Smart Docklands </w:t>
-      </w:r>
-      <w:r>
-        <w:rPr>
-          <w:sz w:val="24"/>
-          <w:szCs w:val="24"/>
-        </w:rPr>
-        <w:t xml:space="preserve">call is Urban Greening / Biodiversity, although the application will focus solely on </w:t>
-      </w:r>
-      <w:r>
-        <w:rPr>
-          <w:sz w:val="24"/>
-          <w:szCs w:val="24"/>
-        </w:rPr>
-        <w:t xml:space="preserve">the </w:t>
-      </w:r>
-      <w:r>
-        <w:rPr>
-          <w:sz w:val="24"/>
-          <w:szCs w:val="24"/>
-        </w:rPr>
-        <w:t>b</w:t>
-      </w:r>
-      <w:r>
-        <w:rPr>
-          <w:sz w:val="24"/>
-          <w:szCs w:val="24"/>
-        </w:rPr>
-        <w:t>iodiversity side of the theme.</w:t>
+        <w:rPr>
+          <w:sz w:val="24"/>
+          <w:szCs w:val="24"/>
+        </w:rPr>
+        <w:t>https://github.com/AlexDaly7/DataStructuresCA</w:t>
       </w:r>
     </w:p>
     <w:p>
@@ -141,7 +64,7 @@
         <w:pStyle w:val="Heading1"/>
       </w:pPr>
       <w:r>
-        <w:t>Application Description</w:t>
+        <w:t>Smart Docklands Theme</w:t>
       </w:r>
     </w:p>
     <w:p>
@@ -156,185 +79,77 @@
           <w:sz w:val="24"/>
           <w:szCs w:val="24"/>
         </w:rPr>
-        <w:t xml:space="preserve">The main menu of the app will </w:t>
-      </w:r>
-      <w:r>
-        <w:rPr>
-          <w:sz w:val="24"/>
-          <w:szCs w:val="24"/>
-        </w:rPr>
-        <w:t>allow users to</w:t>
-      </w:r>
-      <w:r>
-        <w:rPr>
-          <w:sz w:val="24"/>
-          <w:szCs w:val="24"/>
-        </w:rPr>
-        <w:t xml:space="preserve"> create, read, update and delete areas. </w:t>
-      </w:r>
-      <w:r>
-        <w:rPr>
-          <w:sz w:val="24"/>
-          <w:szCs w:val="24"/>
-        </w:rPr>
-        <w:t xml:space="preserve">The areas will be stored in a doubly linked </w:t>
-      </w:r>
-      <w:r>
-        <w:rPr>
-          <w:sz w:val="24"/>
-          <w:szCs w:val="24"/>
-        </w:rPr>
-        <w:t>list</w:t>
-      </w:r>
-      <w:r>
-        <w:rPr>
-          <w:sz w:val="24"/>
-          <w:szCs w:val="24"/>
-        </w:rPr>
-        <w:t>. Doubly linked lists are m</w:t>
-      </w:r>
-      <w:r>
-        <w:rPr>
-          <w:sz w:val="24"/>
-          <w:szCs w:val="24"/>
-        </w:rPr>
-        <w:t>ore efficient than other abstract data types at frequent insertion and deletion, as well as allowing the user to traverse the list in both directions.</w:t>
-      </w:r>
-    </w:p>
-    <w:p>
-      <w:pPr>
-        <w:rPr>
-          <w:sz w:val="24"/>
-          <w:szCs w:val="24"/>
-        </w:rPr>
-      </w:pPr>
-      <w:r>
-        <w:rPr>
-          <w:sz w:val="24"/>
-          <w:szCs w:val="24"/>
-        </w:rPr>
-        <w:t>T</w:t>
-      </w:r>
-      <w:r>
-        <w:rPr>
-          <w:sz w:val="24"/>
-          <w:szCs w:val="24"/>
-        </w:rPr>
-        <w:t xml:space="preserve">he areas will also be in a </w:t>
-      </w:r>
-      <w:r>
-        <w:rPr>
-          <w:sz w:val="24"/>
-          <w:szCs w:val="24"/>
-        </w:rPr>
-        <w:t>priority queue, allowing for the user to jump to the area with the highest severity score at the time</w:t>
-      </w:r>
-      <w:r>
-        <w:rPr>
-          <w:sz w:val="24"/>
-          <w:szCs w:val="24"/>
-        </w:rPr>
-        <w:t>.</w:t>
-      </w:r>
-      <w:r>
-        <w:rPr>
-          <w:sz w:val="24"/>
-          <w:szCs w:val="24"/>
-        </w:rPr>
-        <w:t xml:space="preserve"> Each area will also hold a priority queue consisting of issues</w:t>
-      </w:r>
-      <w:r>
-        <w:rPr>
-          <w:sz w:val="24"/>
-          <w:szCs w:val="24"/>
-        </w:rPr>
-        <w:t>, a</w:t>
-      </w:r>
-      <w:r>
-        <w:rPr>
-          <w:sz w:val="24"/>
-          <w:szCs w:val="24"/>
-        </w:rPr>
-        <w:t xml:space="preserve">llowing </w:t>
-      </w:r>
-      <w:r>
-        <w:rPr>
-          <w:sz w:val="24"/>
-          <w:szCs w:val="24"/>
-        </w:rPr>
-        <w:t>biodiversity issues to be tracked by area.</w:t>
-      </w:r>
-    </w:p>
-    <w:p>
-      <w:pPr>
-        <w:rPr>
-          <w:sz w:val="24"/>
-          <w:szCs w:val="24"/>
-        </w:rPr>
-      </w:pPr>
-      <w:r>
-        <w:rPr>
-          <w:sz w:val="24"/>
-          <w:szCs w:val="24"/>
-        </w:rPr>
-        <w:t xml:space="preserve">Each issue will contain a </w:t>
-      </w:r>
-      <w:r>
-        <w:rPr>
-          <w:sz w:val="24"/>
-          <w:szCs w:val="24"/>
-        </w:rPr>
-        <w:t>singly linked list</w:t>
-      </w:r>
-      <w:r>
-        <w:rPr>
-          <w:sz w:val="24"/>
-          <w:szCs w:val="24"/>
-        </w:rPr>
-        <w:t xml:space="preserve"> of projects meant to address the issue, as well as details of the issue. Each issue will also be given an urgency score that is used to calculate the severity score of an area.</w:t>
-      </w:r>
-    </w:p>
-    <w:p>
-      <w:pPr>
-        <w:rPr>
-          <w:sz w:val="24"/>
-          <w:szCs w:val="24"/>
-        </w:rPr>
-      </w:pPr>
-      <w:r>
-        <w:rPr>
-          <w:sz w:val="24"/>
-          <w:szCs w:val="24"/>
-        </w:rPr>
-        <w:t xml:space="preserve">Each project will </w:t>
-      </w:r>
-      <w:r>
-        <w:rPr>
-          <w:sz w:val="24"/>
-          <w:szCs w:val="24"/>
-        </w:rPr>
-        <w:t xml:space="preserve">have an urgency score that upon completion will be removed from the </w:t>
-      </w:r>
-      <w:r>
-        <w:rPr>
-          <w:sz w:val="24"/>
-          <w:szCs w:val="24"/>
-        </w:rPr>
-        <w:t xml:space="preserve">urgency of the issue. </w:t>
-      </w:r>
-      <w:r>
-        <w:rPr>
-          <w:sz w:val="24"/>
-          <w:szCs w:val="24"/>
-        </w:rPr>
-        <w:t xml:space="preserve">This will </w:t>
-      </w:r>
-      <w:r>
-        <w:rPr>
-          <w:sz w:val="24"/>
-          <w:szCs w:val="24"/>
-        </w:rPr>
-        <w:t>lower the urgency score of the issue and in turn the severity score of the area.</w:t>
+        <w:t>This</w:t>
+      </w:r>
+      <w:r>
+        <w:rPr>
+          <w:sz w:val="24"/>
+          <w:szCs w:val="24"/>
+        </w:rPr>
+        <w:t xml:space="preserve"> application </w:t>
+      </w:r>
+      <w:r>
+        <w:rPr>
+          <w:sz w:val="24"/>
+          <w:szCs w:val="24"/>
+        </w:rPr>
+        <w:t xml:space="preserve">was developed as a solution to the </w:t>
+      </w:r>
+      <w:r>
+        <w:rPr>
+          <w:sz w:val="24"/>
+          <w:szCs w:val="24"/>
+        </w:rPr>
+        <w:t>2025 Smart Docklands</w:t>
+      </w:r>
+      <w:r>
+        <w:rPr>
+          <w:sz w:val="24"/>
+          <w:szCs w:val="24"/>
+        </w:rPr>
+        <w:t xml:space="preserve"> </w:t>
+      </w:r>
+      <w:r>
+        <w:rPr>
+          <w:sz w:val="24"/>
+          <w:szCs w:val="24"/>
+        </w:rPr>
+        <w:t>programme call for pilots.</w:t>
+      </w:r>
+      <w:r>
+        <w:rPr>
+          <w:sz w:val="24"/>
+          <w:szCs w:val="24"/>
+        </w:rPr>
+        <w:t xml:space="preserve"> The theme I chose from the Smart Docklands </w:t>
+      </w:r>
+      <w:r>
+        <w:rPr>
+          <w:sz w:val="24"/>
+          <w:szCs w:val="24"/>
+        </w:rPr>
+        <w:t xml:space="preserve">call is Urban Greening / Biodiversity, although the application will focus solely on </w:t>
+      </w:r>
+      <w:r>
+        <w:rPr>
+          <w:sz w:val="24"/>
+          <w:szCs w:val="24"/>
+        </w:rPr>
+        <w:t xml:space="preserve">the </w:t>
+      </w:r>
+      <w:r>
+        <w:rPr>
+          <w:sz w:val="24"/>
+          <w:szCs w:val="24"/>
+        </w:rPr>
+        <w:t>b</w:t>
+      </w:r>
+      <w:r>
+        <w:rPr>
+          <w:sz w:val="24"/>
+          <w:szCs w:val="24"/>
+        </w:rPr>
+        <w:t>iodiversity side of the theme.</w:t>
       </w:r>
     </w:p>
     <w:p>
@@ -342,7 +157,7 @@
         <w:pStyle w:val="Heading1"/>
       </w:pPr>
       <w:r>
-        <w:t>The problem being solved</w:t>
+        <w:t>Application Description</w:t>
       </w:r>
     </w:p>
     <w:p>
@@ -357,42 +172,49 @@
           <w:sz w:val="24"/>
           <w:szCs w:val="24"/>
         </w:rPr>
-        <w:t>This application w</w:t>
-      </w:r>
-      <w:r>
-        <w:rPr>
-          <w:sz w:val="24"/>
-          <w:szCs w:val="24"/>
-        </w:rPr>
-        <w:t xml:space="preserve">ill </w:t>
-      </w:r>
-      <w:r>
-        <w:rPr>
-          <w:sz w:val="24"/>
-          <w:szCs w:val="24"/>
-        </w:rPr>
-        <w:t xml:space="preserve">be helpful for specifically tracking biodiversity issues as they </w:t>
-      </w:r>
-      <w:r>
-        <w:rPr>
-          <w:sz w:val="24"/>
-          <w:szCs w:val="24"/>
-        </w:rPr>
-        <w:t xml:space="preserve">are usually complex problems with no clear solution. Allowing users </w:t>
-      </w:r>
-      <w:r>
-        <w:rPr>
-          <w:sz w:val="24"/>
-          <w:szCs w:val="24"/>
-        </w:rPr>
-        <w:t xml:space="preserve">to track issues in this manner and have many projects related to issues </w:t>
-      </w:r>
-      <w:r>
-        <w:rPr>
-          <w:sz w:val="24"/>
-          <w:szCs w:val="24"/>
-        </w:rPr>
-        <w:t>is important for these kinds of problems that have no clear solution.</w:t>
+        <w:t xml:space="preserve">The main menu of the app will </w:t>
+      </w:r>
+      <w:r>
+        <w:rPr>
+          <w:sz w:val="24"/>
+          <w:szCs w:val="24"/>
+        </w:rPr>
+        <w:t>allow users to</w:t>
+      </w:r>
+      <w:r>
+        <w:rPr>
+          <w:sz w:val="24"/>
+          <w:szCs w:val="24"/>
+        </w:rPr>
+        <w:t xml:space="preserve"> create, read, update and delete areas. </w:t>
+      </w:r>
+      <w:r>
+        <w:rPr>
+          <w:sz w:val="24"/>
+          <w:szCs w:val="24"/>
+        </w:rPr>
+        <w:t xml:space="preserve">The areas will be stored in a doubly linked </w:t>
+      </w:r>
+      <w:r>
+        <w:rPr>
+          <w:sz w:val="24"/>
+          <w:szCs w:val="24"/>
+        </w:rPr>
+        <w:t>list</w:t>
+      </w:r>
+      <w:r>
+        <w:rPr>
+          <w:sz w:val="24"/>
+          <w:szCs w:val="24"/>
+        </w:rPr>
+        <w:t>. Doubly linked lists are m</w:t>
+      </w:r>
+      <w:r>
+        <w:rPr>
+          <w:sz w:val="24"/>
+          <w:szCs w:val="24"/>
+        </w:rPr>
+        <w:t>ore efficient than other abstract data types at frequent insertion and deletion, as well as allowing the user to traverse the list in both directions.</w:t>
       </w:r>
     </w:p>
     <w:p>
@@ -407,14 +229,128 @@
           <w:sz w:val="24"/>
           <w:szCs w:val="24"/>
         </w:rPr>
-        <w:t xml:space="preserve">The majority of biodiversity problems have a large range of factors and to solve what is seemingly one issue could </w:t>
-      </w:r>
-      <w:r>
-        <w:rPr>
-          <w:sz w:val="24"/>
-          <w:szCs w:val="24"/>
-        </w:rPr>
-        <w:t>take approaching the problem from many different avenues.</w:t>
+        <w:t>T</w:t>
+      </w:r>
+      <w:r>
+        <w:rPr>
+          <w:sz w:val="24"/>
+          <w:szCs w:val="24"/>
+        </w:rPr>
+        <w:t xml:space="preserve">he areas will also be in a </w:t>
+      </w:r>
+      <w:r>
+        <w:rPr>
+          <w:sz w:val="24"/>
+          <w:szCs w:val="24"/>
+        </w:rPr>
+        <w:t>priority queue, allowing for the user to jump to the area with the highest severity score at the time</w:t>
+      </w:r>
+      <w:r>
+        <w:rPr>
+          <w:sz w:val="24"/>
+          <w:szCs w:val="24"/>
+        </w:rPr>
+        <w:t>.</w:t>
+      </w:r>
+      <w:r>
+        <w:rPr>
+          <w:sz w:val="24"/>
+          <w:szCs w:val="24"/>
+        </w:rPr>
+        <w:t xml:space="preserve"> Each area will also hold a priority queue consisting of issues</w:t>
+      </w:r>
+      <w:r>
+        <w:rPr>
+          <w:sz w:val="24"/>
+          <w:szCs w:val="24"/>
+        </w:rPr>
+        <w:t>, a</w:t>
+      </w:r>
+      <w:r>
+        <w:rPr>
+          <w:sz w:val="24"/>
+          <w:szCs w:val="24"/>
+        </w:rPr>
+        <w:t xml:space="preserve">llowing </w:t>
+      </w:r>
+      <w:r>
+        <w:rPr>
+          <w:sz w:val="24"/>
+          <w:szCs w:val="24"/>
+        </w:rPr>
+        <w:t>biodiversity issues to be tracked by area.</w:t>
+      </w:r>
+    </w:p>
+    <w:p>
+      <w:pPr>
+        <w:rPr>
+          <w:sz w:val="24"/>
+          <w:szCs w:val="24"/>
+        </w:rPr>
+      </w:pPr>
+      <w:r>
+        <w:rPr>
+          <w:sz w:val="24"/>
+          <w:szCs w:val="24"/>
+        </w:rPr>
+        <w:t xml:space="preserve">Each issue will contain a </w:t>
+      </w:r>
+      <w:r>
+        <w:rPr>
+          <w:sz w:val="24"/>
+          <w:szCs w:val="24"/>
+        </w:rPr>
+        <w:t>singly linked list</w:t>
+      </w:r>
+      <w:r>
+        <w:rPr>
+          <w:sz w:val="24"/>
+          <w:szCs w:val="24"/>
+        </w:rPr>
+        <w:t xml:space="preserve"> of projects meant to address the issue, as well as details of the issue. Each issue will also be given an urgency score that is used to calculate the severity score of an area.</w:t>
+      </w:r>
+    </w:p>
+    <w:p>
+      <w:pPr>
+        <w:rPr>
+          <w:sz w:val="24"/>
+          <w:szCs w:val="24"/>
+        </w:rPr>
+      </w:pPr>
+      <w:r>
+        <w:rPr>
+          <w:sz w:val="24"/>
+          <w:szCs w:val="24"/>
+        </w:rPr>
+        <w:t xml:space="preserve">Each project will </w:t>
+      </w:r>
+      <w:r>
+        <w:rPr>
+          <w:sz w:val="24"/>
+          <w:szCs w:val="24"/>
+        </w:rPr>
+        <w:t xml:space="preserve">have an urgency score that upon completion will be removed from the </w:t>
+      </w:r>
+      <w:r>
+        <w:rPr>
+          <w:sz w:val="24"/>
+          <w:szCs w:val="24"/>
+        </w:rPr>
+        <w:t xml:space="preserve">urgency of the issue. </w:t>
+      </w:r>
+      <w:r>
+        <w:rPr>
+          <w:sz w:val="24"/>
+          <w:szCs w:val="24"/>
+        </w:rPr>
+        <w:t xml:space="preserve">This will </w:t>
+      </w:r>
+      <w:r>
+        <w:rPr>
+          <w:sz w:val="24"/>
+          <w:szCs w:val="24"/>
+        </w:rPr>
+        <w:t>lower the urgency score of the issue and in turn the severity score of the area.</w:t>
       </w:r>
     </w:p>
     <w:p>
@@ -422,52 +358,79 @@
         <w:pStyle w:val="Heading1"/>
       </w:pPr>
       <w:r>
-        <w:t>How it fits the theme</w:t>
+        <w:t>The problem being solved</w:t>
       </w:r>
     </w:p>
     <w:p>
-      <w:r>
-        <w:rPr>
-          <w:sz w:val="24"/>
-          <w:szCs w:val="24"/>
-        </w:rPr>
-        <w:t>As mentioned under the previous heading</w:t>
-      </w:r>
-      <w:r>
-        <w:rPr>
-          <w:sz w:val="24"/>
-          <w:szCs w:val="24"/>
-        </w:rPr>
-        <w:t xml:space="preserve">, this application will help to solve biodiversity issues in urban areas by allowing users to attribute many differing projects to </w:t>
-      </w:r>
-      <w:r>
-        <w:rPr>
-          <w:sz w:val="24"/>
-          <w:szCs w:val="24"/>
-        </w:rPr>
-        <w:t>a single apparent issue. Which more closely represents the real</w:t>
-      </w:r>
-      <w:r>
-        <w:rPr>
-          <w:sz w:val="24"/>
-          <w:szCs w:val="24"/>
-        </w:rPr>
-        <w:t>-</w:t>
-      </w:r>
-      <w:r>
-        <w:rPr>
-          <w:sz w:val="24"/>
-          <w:szCs w:val="24"/>
-        </w:rPr>
-        <w:t>world experience</w:t>
-      </w:r>
-      <w:r>
-        <w:t>.</w:t>
+      <w:pPr>
+        <w:rPr>
+          <w:sz w:val="24"/>
+          <w:szCs w:val="24"/>
+        </w:rPr>
+      </w:pPr>
+      <w:r>
+        <w:rPr>
+          <w:sz w:val="24"/>
+          <w:szCs w:val="24"/>
+        </w:rPr>
+        <w:t>This application w</w:t>
+      </w:r>
+      <w:r>
+        <w:rPr>
+          <w:sz w:val="24"/>
+          <w:szCs w:val="24"/>
+        </w:rPr>
+        <w:t xml:space="preserve">ill </w:t>
+      </w:r>
+      <w:r>
+        <w:rPr>
+          <w:sz w:val="24"/>
+          <w:szCs w:val="24"/>
+        </w:rPr>
+        <w:t xml:space="preserve">be helpful for specifically tracking biodiversity issues as they </w:t>
+      </w:r>
+      <w:r>
+        <w:rPr>
+          <w:sz w:val="24"/>
+          <w:szCs w:val="24"/>
+        </w:rPr>
+        <w:t xml:space="preserve">are usually complex problems with no clear solution. Allowing users </w:t>
+      </w:r>
+      <w:r>
+        <w:rPr>
+          <w:sz w:val="24"/>
+          <w:szCs w:val="24"/>
+        </w:rPr>
+        <w:t xml:space="preserve">to track issues in this manner and have many projects related to issues </w:t>
+      </w:r>
+      <w:r>
+        <w:rPr>
+          <w:sz w:val="24"/>
+          <w:szCs w:val="24"/>
+        </w:rPr>
+        <w:t>is important for these kinds of problems that have no clear solution.</w:t>
       </w:r>
     </w:p>
     <w:p>
-      <w:r>
-        <w:br w:type="page"/>
+      <w:pPr>
+        <w:rPr>
+          <w:sz w:val="24"/>
+          <w:szCs w:val="24"/>
+        </w:rPr>
+      </w:pPr>
+      <w:r>
+        <w:rPr>
+          <w:sz w:val="24"/>
+          <w:szCs w:val="24"/>
+        </w:rPr>
+        <w:t xml:space="preserve">The majority of biodiversity problems have a large range of factors and to solve what is seemingly one issue could </w:t>
+      </w:r>
+      <w:r>
+        <w:rPr>
+          <w:sz w:val="24"/>
+          <w:szCs w:val="24"/>
+        </w:rPr>
+        <w:t>take approaching the problem from many different avenues.</w:t>
       </w:r>
     </w:p>
     <w:p>
@@ -475,6 +438,57 @@
         <w:pStyle w:val="Heading1"/>
       </w:pPr>
       <w:r>
+        <w:t>How it fits the theme</w:t>
+      </w:r>
+    </w:p>
+    <w:p>
+      <w:r>
+        <w:rPr>
+          <w:sz w:val="24"/>
+          <w:szCs w:val="24"/>
+        </w:rPr>
+        <w:t>As mentioned under the previous heading</w:t>
+      </w:r>
+      <w:r>
+        <w:rPr>
+          <w:sz w:val="24"/>
+          <w:szCs w:val="24"/>
+        </w:rPr>
+        <w:t xml:space="preserve">, this application will help to solve biodiversity issues in urban areas by allowing users to attribute many differing projects to </w:t>
+      </w:r>
+      <w:r>
+        <w:rPr>
+          <w:sz w:val="24"/>
+          <w:szCs w:val="24"/>
+        </w:rPr>
+        <w:t>a single apparent issue. Which more closely represents the real</w:t>
+      </w:r>
+      <w:r>
+        <w:rPr>
+          <w:sz w:val="24"/>
+          <w:szCs w:val="24"/>
+        </w:rPr>
+        <w:t>-</w:t>
+      </w:r>
+      <w:r>
+        <w:rPr>
+          <w:sz w:val="24"/>
+          <w:szCs w:val="24"/>
+        </w:rPr>
+        <w:t>world experience</w:t>
+      </w:r>
+      <w:r>
+        <w:t>.</w:t>
+      </w:r>
+    </w:p>
+    <w:p>
+      <w:pPr>
+        <w:pStyle w:val="Heading1"/>
+      </w:pPr>
+      <w:r>
+        <w:br w:type="page"/>
+      </w:r>
+      <w:r>
         <w:lastRenderedPageBreak/>
         <w:t>Class Diagram</w:t>
       </w:r>
@@ -485,10 +499,10 @@
           <w:noProof/>
         </w:rPr>
         <w:drawing>
-          <wp:inline distT="0" distB="0" distL="0" distR="0" wp14:anchorId="52C949EA" wp14:editId="48C80264">
-            <wp:extent cx="6184900" cy="7581900"/>
-            <wp:effectExtent l="0" t="0" r="6350" b="0"/>
-            <wp:docPr id="1930160561" name="Picture 2"/>
+          <wp:inline distT="0" distB="0" distL="0" distR="0" wp14:anchorId="12100CF3" wp14:editId="418BC430">
+            <wp:extent cx="6215981" cy="7620000"/>
+            <wp:effectExtent l="0" t="0" r="0" b="0"/>
+            <wp:docPr id="1977596207" name="Picture 1"/>
             <wp:cNvGraphicFramePr>
               <a:graphicFrameLocks xmlns:a="http://schemas.openxmlformats.org/drawingml/2006/main" noChangeAspect="1"/>
             </wp:cNvGraphicFramePr>
@@ -496,7 +510,7 @@
               <a:graphicData uri="http://schemas.openxmlformats.org/drawingml/2006/picture">
                 <pic:pic xmlns:pic="http://schemas.openxmlformats.org/drawingml/2006/picture">
                   <pic:nvPicPr>
-                    <pic:cNvPr id="0" name="Picture 2"/>
+                    <pic:cNvPr id="0" name="Picture 1"/>
                     <pic:cNvPicPr>
                       <a:picLocks noChangeAspect="1" noChangeArrowheads="1"/>
                     </pic:cNvPicPr>
@@ -517,7 +531,7 @@
                   <pic:spPr bwMode="auto">
                     <a:xfrm>
                       <a:off x="0" y="0"/>
-                      <a:ext cx="6184900" cy="7581900"/>
+                      <a:ext cx="6231319" cy="7638803"/>
                     </a:xfrm>
                     <a:prstGeom prst="rect">
                       <a:avLst/>
@@ -1758,6 +1772,23 @@
 </file>
 
 <file path=customXml/item1.xml><?xml version="1.0" encoding="utf-8"?>
+<p:properties xmlns:p="http://schemas.microsoft.com/office/2006/metadata/properties" xmlns:xsi="http://www.w3.org/2001/XMLSchema-instance" xmlns:pc="http://schemas.microsoft.com/office/infopath/2007/PartnerControls">
+  <documentManagement>
+    <_activity xmlns="bc076155-b42d-49c0-9103-56bbb3703038" xsi:nil="true"/>
+  </documentManagement>
+</p:properties>
+</file>
+
+<file path=customXml/item2.xml><?xml version="1.0" encoding="utf-8"?>
+<?mso-contentType ?>
+<FormTemplates xmlns="http://schemas.microsoft.com/sharepoint/v3/contenttype/forms">
+  <Display>DocumentLibraryForm</Display>
+  <Edit>DocumentLibraryForm</Edit>
+  <New>DocumentLibraryForm</New>
+</FormTemplates>
+</file>
+
+<file path=customXml/item3.xml><?xml version="1.0" encoding="utf-8"?>
 <ct:contentTypeSchema xmlns:ct="http://schemas.microsoft.com/office/2006/metadata/contentType" xmlns:ma="http://schemas.microsoft.com/office/2006/metadata/properties/metaAttributes" ct:_="" ma:_="" ma:contentTypeName="Document" ma:contentTypeID="0x01010039CF77FF9592144BB7065041DD04ADBC" ma:contentTypeVersion="11" ma:contentTypeDescription="Create a new document." ma:contentTypeScope="" ma:versionID="b45905e52b44292dc4bcc63ac44bf539">
   <xsd:schema xmlns:xsd="http://www.w3.org/2001/XMLSchema" xmlns:xs="http://www.w3.org/2001/XMLSchema" xmlns:p="http://schemas.microsoft.com/office/2006/metadata/properties" xmlns:ns3="bc076155-b42d-49c0-9103-56bbb3703038" targetNamespace="http://schemas.microsoft.com/office/2006/metadata/properties" ma:root="true" ma:fieldsID="8f1844e9226261b95c2a24cdda653633" ns3:_="">
     <xsd:import namespace="bc076155-b42d-49c0-9103-56bbb3703038"/>
@@ -1945,24 +1976,25 @@
 </ct:contentTypeSchema>
 </file>
 
-<file path=customXml/item2.xml><?xml version="1.0" encoding="utf-8"?>
-<?mso-contentType ?>
-<FormTemplates xmlns="http://schemas.microsoft.com/sharepoint/v3/contenttype/forms">
-  <Display>DocumentLibraryForm</Display>
-  <Edit>DocumentLibraryForm</Edit>
-  <New>DocumentLibraryForm</New>
-</FormTemplates>
+<file path=customXml/itemProps1.xml><?xml version="1.0" encoding="utf-8"?>
+<ds:datastoreItem xmlns:ds="http://schemas.openxmlformats.org/officeDocument/2006/customXml" ds:itemID="{56FF02F6-7DF6-4DF7-8B4F-A6E693DD93C3}">
+  <ds:schemaRefs>
+    <ds:schemaRef ds:uri="http://schemas.microsoft.com/office/2006/metadata/properties"/>
+    <ds:schemaRef ds:uri="http://schemas.microsoft.com/office/infopath/2007/PartnerControls"/>
+    <ds:schemaRef ds:uri="bc076155-b42d-49c0-9103-56bbb3703038"/>
+  </ds:schemaRefs>
+</ds:datastoreItem>
 </file>
 
-<file path=customXml/item3.xml><?xml version="1.0" encoding="utf-8"?>
-<p:properties xmlns:p="http://schemas.microsoft.com/office/2006/metadata/properties" xmlns:xsi="http://www.w3.org/2001/XMLSchema-instance" xmlns:pc="http://schemas.microsoft.com/office/infopath/2007/PartnerControls">
-  <documentManagement>
-    <_activity xmlns="bc076155-b42d-49c0-9103-56bbb3703038" xsi:nil="true"/>
-  </documentManagement>
-</p:properties>
+<file path=customXml/itemProps2.xml><?xml version="1.0" encoding="utf-8"?>
+<ds:datastoreItem xmlns:ds="http://schemas.openxmlformats.org/officeDocument/2006/customXml" ds:itemID="{A37415C9-9CDF-4469-9544-1B9FEA9E33FD}">
+  <ds:schemaRefs>
+    <ds:schemaRef ds:uri="http://schemas.microsoft.com/sharepoint/v3/contenttype/forms"/>
+  </ds:schemaRefs>
+</ds:datastoreItem>
 </file>
 
-<file path=customXml/itemProps1.xml><?xml version="1.0" encoding="utf-8"?>
+<file path=customXml/itemProps3.xml><?xml version="1.0" encoding="utf-8"?>
 <ds:datastoreItem xmlns:ds="http://schemas.openxmlformats.org/officeDocument/2006/customXml" ds:itemID="{3DFADE27-50DD-4985-9BF5-ABF102536167}">
   <ds:schemaRefs>
     <ds:schemaRef ds:uri="http://schemas.microsoft.com/office/2006/metadata/contentType"/>
@@ -1978,22 +2010,4 @@
     <ds:schemaRef ds:uri="http://schemas.microsoft.com/internal/obd"/>
   </ds:schemaRefs>
 </ds:datastoreItem>
-</file>
-
-<file path=customXml/itemProps2.xml><?xml version="1.0" encoding="utf-8"?>
-<ds:datastoreItem xmlns:ds="http://schemas.openxmlformats.org/officeDocument/2006/customXml" ds:itemID="{A37415C9-9CDF-4469-9544-1B9FEA9E33FD}">
-  <ds:schemaRefs>
-    <ds:schemaRef ds:uri="http://schemas.microsoft.com/sharepoint/v3/contenttype/forms"/>
-  </ds:schemaRefs>
-</ds:datastoreItem>
-</file>
-
-<file path=customXml/itemProps3.xml><?xml version="1.0" encoding="utf-8"?>
-<ds:datastoreItem xmlns:ds="http://schemas.openxmlformats.org/officeDocument/2006/customXml" ds:itemID="{56FF02F6-7DF6-4DF7-8B4F-A6E693DD93C3}">
-  <ds:schemaRefs>
-    <ds:schemaRef ds:uri="http://schemas.microsoft.com/office/2006/metadata/properties"/>
-    <ds:schemaRef ds:uri="http://schemas.microsoft.com/office/infopath/2007/PartnerControls"/>
-    <ds:schemaRef ds:uri="bc076155-b42d-49c0-9103-56bbb3703038"/>
-  </ds:schemaRefs>
-</ds:datastoreItem>
 </file>
</xml_diff>